<commit_message>
Quitar el documento de validacion y sus capturas (se hara aparte)
El documento de validacion y pruebas lo redacta el autor con su propia evidencia.
Se ajustan README y manual de nube para no referirse a el.

Co-Authored-By: Claude Sonnet 5.5 <noreply@anthropic.com>
</commit_message>
<xml_diff>
--- a/docs/MANUAL_DESPLIEGUE_NUBE.docx
+++ b/docs/MANUAL_DESPLIEGUE_NUBE.docx
@@ -4604,7 +4604,7 @@
               <w:rPr>
                 <w:sz w:val="18"/>
               </w:rPr>
-              <w:t>, de este manual y del documento de validación, y en la generación de pruebas y código. Todo se revisó y se probó ejecutándolo</w:t>
+              <w:t>, y de este manual, y en la generación de pruebas y código. Todo se revisó y se probó ejecutándolo</w:t>
             </w:r>
           </w:p>
         </w:tc>
@@ -4840,7 +4840,7 @@
       </w:r>
       <w:r>
         <w:rPr/>
-        <w:t>: las instrucciones y resultados de este manual que se pudieron comprobar localmente se ejecutaron y están registrados en el documento de validación.</w:t>
+        <w:t>: las instrucciones y resultados de este manual que se pudieron comprobar localmente se ejecutaron en un entorno local (ver la sección 3.4).</w:t>
       </w:r>
     </w:p>
     <w:sectPr>

</xml_diff>